<commit_message>
feat: add new project fields (work hours and execution date)
</commit_message>
<xml_diff>
--- a/Padlás födém szigetelés dokumentum managment/templates/2026 atadas_atveteli.docx
+++ b/Padlás födém szigetelés dokumentum managment/templates/2026 atadas_atveteli.docx
@@ -524,6 +524,7 @@
           <w:rFonts w:ascii="Times New Roman" w:eastAsia="Times New Roman" w:hAnsi="Times New Roman" w:cs="Times New Roman"/>
         </w:rPr>
       </w:pPr>
+      <w:proofErr w:type="gramStart"/>
       <w:r>
         <w:rPr>
           <w:rFonts w:ascii="Times New Roman" w:eastAsia="Times New Roman" w:hAnsi="Times New Roman" w:cs="Times New Roman"/>
@@ -536,13 +537,39 @@
         <w:rPr>
           <w:rFonts w:ascii="Times New Roman" w:eastAsia="Times New Roman" w:hAnsi="Times New Roman" w:cs="Times New Roman"/>
         </w:rPr>
-        <w:t xml:space="preserve"> </w:t>
-      </w:r>
-      <w:r>
-        <w:rPr>
-          <w:rFonts w:ascii="Times New Roman" w:eastAsia="Times New Roman" w:hAnsi="Times New Roman" w:cs="Times New Roman"/>
-        </w:rPr>
-        <w:tab/>
+        <w:t xml:space="preserve">   </w:t>
+      </w:r>
+      <w:proofErr w:type="gramEnd"/>
+      <w:r>
+        <w:rPr>
+          <w:rFonts w:ascii="Times New Roman" w:eastAsia="Times New Roman" w:hAnsi="Times New Roman" w:cs="Times New Roman"/>
+        </w:rPr>
+        <w:t xml:space="preserve">  </w:t>
+      </w:r>
+      <w:r>
+        <w:rPr>
+          <w:rFonts w:ascii="Times New Roman" w:hAnsi="Times New Roman" w:cs="Times New Roman"/>
+        </w:rPr>
+        <w:t>[[</w:t>
+      </w:r>
+      <w:proofErr w:type="spellStart"/>
+      <w:r>
+        <w:rPr>
+          <w:rFonts w:ascii="Times New Roman" w:hAnsi="Times New Roman" w:cs="Times New Roman"/>
+        </w:rPr>
+        <w:t>nev</w:t>
+      </w:r>
+      <w:proofErr w:type="spellEnd"/>
+      <w:r>
+        <w:rPr>
+          <w:rFonts w:ascii="Times New Roman" w:hAnsi="Times New Roman" w:cs="Times New Roman"/>
+        </w:rPr>
+        <w:t>]]</w:t>
+      </w:r>
+      <w:r>
+        <w:rPr>
+          <w:rFonts w:ascii="Times New Roman" w:eastAsia="Times New Roman" w:hAnsi="Times New Roman" w:cs="Times New Roman"/>
+        </w:rPr>
         <w:t xml:space="preserve"> </w:t>
       </w:r>
     </w:p>
@@ -570,7 +597,27 @@
         <w:rPr>
           <w:rFonts w:ascii="Times New Roman" w:eastAsia="Times New Roman" w:hAnsi="Times New Roman" w:cs="Times New Roman"/>
         </w:rPr>
-        <w:t>[[cim]]</w:t>
+        <w:tab/>
+      </w:r>
+      <w:r>
+        <w:rPr>
+          <w:rFonts w:ascii="Times New Roman" w:eastAsia="Times New Roman" w:hAnsi="Times New Roman" w:cs="Times New Roman"/>
+        </w:rPr>
+        <w:t>[[</w:t>
+      </w:r>
+      <w:proofErr w:type="spellStart"/>
+      <w:r>
+        <w:rPr>
+          <w:rFonts w:ascii="Times New Roman" w:eastAsia="Times New Roman" w:hAnsi="Times New Roman" w:cs="Times New Roman"/>
+        </w:rPr>
+        <w:t>cim</w:t>
+      </w:r>
+      <w:proofErr w:type="spellEnd"/>
+      <w:r>
+        <w:rPr>
+          <w:rFonts w:ascii="Times New Roman" w:eastAsia="Times New Roman" w:hAnsi="Times New Roman" w:cs="Times New Roman"/>
+        </w:rPr>
+        <w:t>]]</w:t>
       </w:r>
       <w:r>
         <w:rPr>
@@ -610,7 +657,27 @@
         <w:rPr>
           <w:rFonts w:ascii="Times New Roman" w:eastAsia="Times New Roman" w:hAnsi="Times New Roman" w:cs="Times New Roman"/>
         </w:rPr>
-        <w:t>[[szemelyi]]</w:t>
+        <w:tab/>
+      </w:r>
+      <w:r>
+        <w:rPr>
+          <w:rFonts w:ascii="Times New Roman" w:eastAsia="Times New Roman" w:hAnsi="Times New Roman" w:cs="Times New Roman"/>
+        </w:rPr>
+        <w:t>[[</w:t>
+      </w:r>
+      <w:proofErr w:type="spellStart"/>
+      <w:r>
+        <w:rPr>
+          <w:rFonts w:ascii="Times New Roman" w:eastAsia="Times New Roman" w:hAnsi="Times New Roman" w:cs="Times New Roman"/>
+        </w:rPr>
+        <w:t>szemelyi</w:t>
+      </w:r>
+      <w:proofErr w:type="spellEnd"/>
+      <w:r>
+        <w:rPr>
+          <w:rFonts w:ascii="Times New Roman" w:eastAsia="Times New Roman" w:hAnsi="Times New Roman" w:cs="Times New Roman"/>
+        </w:rPr>
+        <w:t>]]</w:t>
       </w:r>
     </w:p>
     <w:p>
@@ -1717,126 +1784,56 @@
       <w:r>
         <w:rPr>
           <w:rFonts w:ascii="Times New Roman" w:eastAsia="Times New Roman" w:hAnsi="Times New Roman" w:cs="Times New Roman"/>
+        </w:rPr>
+        <w:t xml:space="preserve"> </w:t>
+      </w:r>
+    </w:p>
+    <w:p>
+      <w:pPr>
+        <w:ind w:left="-5"/>
+        <w:rPr>
+          <w:rFonts w:ascii="Times New Roman" w:eastAsia="Times New Roman" w:hAnsi="Times New Roman" w:cs="Times New Roman"/>
+        </w:rPr>
+      </w:pPr>
+      <w:r>
+        <w:rPr>
+          <w:rFonts w:ascii="Times New Roman" w:eastAsia="Times New Roman" w:hAnsi="Times New Roman" w:cs="Times New Roman"/>
+        </w:rPr>
+        <w:t xml:space="preserve">Kelt.: </w:t>
+      </w:r>
+      <w:proofErr w:type="gramStart"/>
+      <w:r>
+        <w:rPr>
+          <w:rFonts w:ascii="Times New Roman" w:eastAsia="Times New Roman" w:hAnsi="Times New Roman" w:cs="Times New Roman"/>
+        </w:rPr>
+        <w:t>Rád ,</w:t>
+      </w:r>
+      <w:proofErr w:type="gramEnd"/>
+      <w:r>
+        <w:rPr>
+          <w:rFonts w:ascii="Times New Roman" w:eastAsia="Times New Roman" w:hAnsi="Times New Roman" w:cs="Times New Roman"/>
+        </w:rPr>
+        <w:t xml:space="preserve"> [[datum]]</w:t>
+      </w:r>
+    </w:p>
+    <w:p>
+      <w:pPr>
+        <w:spacing w:after="0" w:line="259" w:lineRule="auto"/>
+        <w:ind w:left="0"/>
+        <w:jc w:val="left"/>
+        <w:rPr>
+          <w:rFonts w:ascii="Times New Roman" w:eastAsia="Times New Roman" w:hAnsi="Times New Roman" w:cs="Times New Roman"/>
+        </w:rPr>
+      </w:pPr>
+      <w:r>
+        <w:rPr>
+          <w:rFonts w:ascii="Times New Roman" w:eastAsia="Times New Roman" w:hAnsi="Times New Roman" w:cs="Times New Roman"/>
           <w:noProof/>
           <w:sz w:val="21"/>
           <w:szCs w:val="21"/>
         </w:rPr>
         <w:drawing>
-          <wp:anchor distT="0" distB="0" distL="114300" distR="114300" simplePos="0" relativeHeight="251672064" behindDoc="0" locked="0" layoutInCell="1" allowOverlap="1" wp14:anchorId="10AD696C" wp14:editId="6E222EDB">
-            <wp:simplePos x="0" y="0"/>
-            <wp:positionH relativeFrom="margin">
-              <wp:posOffset>3378313</wp:posOffset>
-            </wp:positionH>
-            <wp:positionV relativeFrom="paragraph">
-              <wp:posOffset>110825</wp:posOffset>
-            </wp:positionV>
-            <wp:extent cx="2311356" cy="3090902"/>
-            <wp:effectExtent l="0" t="0" r="0" b="0"/>
-            <wp:wrapNone/>
-            <wp:docPr id="1178979612" name="Kép 2"/>
-            <wp:cNvGraphicFramePr>
-              <a:graphicFrameLocks xmlns:a="http://schemas.openxmlformats.org/drawingml/2006/main" noChangeAspect="1"/>
-            </wp:cNvGraphicFramePr>
-            <a:graphic xmlns:a="http://schemas.openxmlformats.org/drawingml/2006/main">
-              <a:graphicData uri="http://schemas.openxmlformats.org/drawingml/2006/picture">
-                <pic:pic xmlns:pic="http://schemas.openxmlformats.org/drawingml/2006/picture">
-                  <pic:nvPicPr>
-                    <pic:cNvPr id="0" name="Picture 2"/>
-                    <pic:cNvPicPr>
-                      <a:picLocks noChangeAspect="1" noChangeArrowheads="1"/>
-                    </pic:cNvPicPr>
-                  </pic:nvPicPr>
-                  <pic:blipFill>
-                    <a:blip r:embed="rId8" cstate="print">
-                      <a:extLst>
-                        <a:ext uri="{28A0092B-C50C-407E-A947-70E740481C1C}">
-                          <a14:useLocalDpi xmlns:a14="http://schemas.microsoft.com/office/drawing/2010/main" val="0"/>
-                        </a:ext>
-                      </a:extLst>
-                    </a:blip>
-                    <a:srcRect/>
-                    <a:stretch>
-                      <a:fillRect/>
-                    </a:stretch>
-                  </pic:blipFill>
-                  <pic:spPr bwMode="auto">
-                    <a:xfrm>
-                      <a:off x="0" y="0"/>
-                      <a:ext cx="2311356" cy="3090902"/>
-                    </a:xfrm>
-                    <a:prstGeom prst="rect">
-                      <a:avLst/>
-                    </a:prstGeom>
-                    <a:noFill/>
-                    <a:ln>
-                      <a:noFill/>
-                    </a:ln>
-                  </pic:spPr>
-                </pic:pic>
-              </a:graphicData>
-            </a:graphic>
-            <wp14:sizeRelH relativeFrom="margin">
-              <wp14:pctWidth>0</wp14:pctWidth>
-            </wp14:sizeRelH>
-            <wp14:sizeRelV relativeFrom="margin">
-              <wp14:pctHeight>0</wp14:pctHeight>
-            </wp14:sizeRelV>
-          </wp:anchor>
-        </w:drawing>
-      </w:r>
-      <w:r>
-        <w:rPr>
-          <w:rFonts w:ascii="Times New Roman" w:eastAsia="Times New Roman" w:hAnsi="Times New Roman" w:cs="Times New Roman"/>
-        </w:rPr>
-        <w:t xml:space="preserve"> </w:t>
-      </w:r>
-    </w:p>
-    <w:p>
-      <w:pPr>
-        <w:ind w:left="-5"/>
-        <w:rPr>
-          <w:rFonts w:ascii="Times New Roman" w:eastAsia="Times New Roman" w:hAnsi="Times New Roman" w:cs="Times New Roman"/>
-        </w:rPr>
-      </w:pPr>
-      <w:r>
-        <w:rPr>
-          <w:rFonts w:ascii="Times New Roman" w:eastAsia="Times New Roman" w:hAnsi="Times New Roman" w:cs="Times New Roman"/>
-        </w:rPr>
-        <w:t xml:space="preserve">Kelt.: </w:t>
-      </w:r>
-      <w:proofErr w:type="gramStart"/>
-      <w:r>
-        <w:rPr>
-          <w:rFonts w:ascii="Times New Roman" w:eastAsia="Times New Roman" w:hAnsi="Times New Roman" w:cs="Times New Roman"/>
-        </w:rPr>
-        <w:t>Rád ,</w:t>
-      </w:r>
-      <w:proofErr w:type="gramEnd"/>
-      <w:r>
-        <w:rPr>
-          <w:rFonts w:ascii="Times New Roman" w:eastAsia="Times New Roman" w:hAnsi="Times New Roman" w:cs="Times New Roman"/>
-        </w:rPr>
-        <w:t xml:space="preserve"> [[datum]]</w:t>
-      </w:r>
-    </w:p>
-    <w:p>
-      <w:pPr>
-        <w:spacing w:after="0" w:line="259" w:lineRule="auto"/>
-        <w:ind w:left="0"/>
-        <w:jc w:val="left"/>
-        <w:rPr>
-          <w:rFonts w:ascii="Times New Roman" w:eastAsia="Times New Roman" w:hAnsi="Times New Roman" w:cs="Times New Roman"/>
-        </w:rPr>
-      </w:pPr>
-      <w:r>
-        <w:rPr>
-          <w:rFonts w:ascii="Times New Roman" w:eastAsia="Times New Roman" w:hAnsi="Times New Roman" w:cs="Times New Roman"/>
-          <w:noProof/>
-          <w:sz w:val="21"/>
-          <w:szCs w:val="21"/>
-        </w:rPr>
-        <w:drawing>
-          <wp:anchor distT="0" distB="0" distL="114300" distR="114300" simplePos="0" relativeHeight="251657728" behindDoc="0" locked="0" layoutInCell="1" allowOverlap="1" wp14:anchorId="703A328D" wp14:editId="05C1929C">
+          <wp:anchor distT="0" distB="0" distL="114300" distR="114300" simplePos="0" relativeHeight="251657728" behindDoc="0" locked="0" layoutInCell="1" allowOverlap="1" wp14:anchorId="703A328D" wp14:editId="061C9A4F">
             <wp:simplePos x="0" y="0"/>
             <wp:positionH relativeFrom="margin">
               <wp:posOffset>3549047</wp:posOffset>
@@ -1861,7 +1858,7 @@
                     </pic:cNvPicPr>
                   </pic:nvPicPr>
                   <pic:blipFill>
-                    <a:blip r:embed="rId9" cstate="print">
+                    <a:blip r:embed="rId8" cstate="print">
                       <a:extLst>
                         <a:ext uri="{28A0092B-C50C-407E-A947-70E740481C1C}">
                           <a14:useLocalDpi xmlns:a14="http://schemas.microsoft.com/office/drawing/2010/main" val="0"/>
@@ -2083,6 +2080,76 @@
                 <w:rFonts w:ascii="Times New Roman" w:eastAsia="Times New Roman" w:hAnsi="Times New Roman" w:cs="Times New Roman"/>
               </w:rPr>
             </w:pPr>
+            <w:r>
+              <w:rPr>
+                <w:rFonts w:ascii="Times New Roman" w:eastAsia="Times New Roman" w:hAnsi="Times New Roman" w:cs="Times New Roman"/>
+                <w:noProof/>
+                <w:sz w:val="21"/>
+                <w:szCs w:val="21"/>
+              </w:rPr>
+              <w:drawing>
+                <wp:anchor distT="0" distB="0" distL="114300" distR="114300" simplePos="0" relativeHeight="251672064" behindDoc="0" locked="0" layoutInCell="1" allowOverlap="1" wp14:anchorId="10AD696C" wp14:editId="45E8CBB7">
+                  <wp:simplePos x="0" y="0"/>
+                  <wp:positionH relativeFrom="margin">
+                    <wp:posOffset>445770</wp:posOffset>
+                  </wp:positionH>
+                  <wp:positionV relativeFrom="paragraph">
+                    <wp:posOffset>-1538605</wp:posOffset>
+                  </wp:positionV>
+                  <wp:extent cx="2311356" cy="3090902"/>
+                  <wp:effectExtent l="0" t="0" r="0" b="0"/>
+                  <wp:wrapNone/>
+                  <wp:docPr id="1178979612" name="Kép 2"/>
+                  <wp:cNvGraphicFramePr>
+                    <a:graphicFrameLocks xmlns:a="http://schemas.openxmlformats.org/drawingml/2006/main" noChangeAspect="1"/>
+                  </wp:cNvGraphicFramePr>
+                  <a:graphic xmlns:a="http://schemas.openxmlformats.org/drawingml/2006/main">
+                    <a:graphicData uri="http://schemas.openxmlformats.org/drawingml/2006/picture">
+                      <pic:pic xmlns:pic="http://schemas.openxmlformats.org/drawingml/2006/picture">
+                        <pic:nvPicPr>
+                          <pic:cNvPr id="0" name="Picture 2"/>
+                          <pic:cNvPicPr>
+                            <a:picLocks noChangeAspect="1" noChangeArrowheads="1"/>
+                          </pic:cNvPicPr>
+                        </pic:nvPicPr>
+                        <pic:blipFill>
+                          <a:blip r:embed="rId9" cstate="print">
+                            <a:extLst>
+                              <a:ext uri="{28A0092B-C50C-407E-A947-70E740481C1C}">
+                                <a14:useLocalDpi xmlns:a14="http://schemas.microsoft.com/office/drawing/2010/main" val="0"/>
+                              </a:ext>
+                            </a:extLst>
+                          </a:blip>
+                          <a:srcRect/>
+                          <a:stretch>
+                            <a:fillRect/>
+                          </a:stretch>
+                        </pic:blipFill>
+                        <pic:spPr bwMode="auto">
+                          <a:xfrm>
+                            <a:off x="0" y="0"/>
+                            <a:ext cx="2311356" cy="3090902"/>
+                          </a:xfrm>
+                          <a:prstGeom prst="rect">
+                            <a:avLst/>
+                          </a:prstGeom>
+                          <a:noFill/>
+                          <a:ln>
+                            <a:noFill/>
+                          </a:ln>
+                        </pic:spPr>
+                      </pic:pic>
+                    </a:graphicData>
+                  </a:graphic>
+                  <wp14:sizeRelH relativeFrom="margin">
+                    <wp14:pctWidth>0</wp14:pctWidth>
+                  </wp14:sizeRelH>
+                  <wp14:sizeRelV relativeFrom="margin">
+                    <wp14:pctHeight>0</wp14:pctHeight>
+                  </wp14:sizeRelV>
+                </wp:anchor>
+              </w:drawing>
+            </w:r>
             <w:r>
               <w:rPr>
                 <w:rFonts w:ascii="Times New Roman" w:eastAsia="Times New Roman" w:hAnsi="Times New Roman" w:cs="Times New Roman"/>

</xml_diff>

<commit_message>
feat: update Word templates with new variables for 2026 docs
</commit_message>
<xml_diff>
--- a/Padlás födém szigetelés dokumentum managment/templates/2026 atadas_atveteli.docx
+++ b/Padlás födém szigetelés dokumentum managment/templates/2026 atadas_atveteli.docx
@@ -219,7 +219,6 @@
                 <w:rFonts w:ascii="Times New Roman" w:eastAsia="Times New Roman" w:hAnsi="Times New Roman" w:cs="Times New Roman"/>
               </w:rPr>
             </w:pPr>
-            <w:proofErr w:type="gramStart"/>
             <w:r>
               <w:rPr>
                 <w:rFonts w:ascii="Times New Roman" w:eastAsia="Times New Roman" w:hAnsi="Times New Roman" w:cs="Times New Roman"/>
@@ -231,12 +230,6 @@
                 <w:rFonts w:ascii="Times New Roman" w:eastAsia="Times New Roman" w:hAnsi="Times New Roman" w:cs="Times New Roman"/>
               </w:rPr>
               <w:tab/>
-            </w:r>
-            <w:proofErr w:type="gramEnd"/>
-            <w:r>
-              <w:rPr>
-                <w:rFonts w:ascii="Times New Roman" w:eastAsia="Times New Roman" w:hAnsi="Times New Roman" w:cs="Times New Roman"/>
-              </w:rPr>
               <w:t xml:space="preserve"> </w:t>
             </w:r>
           </w:p>
@@ -452,19 +445,11 @@
                 <w:rFonts w:ascii="Times New Roman" w:eastAsia="Times New Roman" w:hAnsi="Times New Roman" w:cs="Times New Roman"/>
               </w:rPr>
             </w:pPr>
-            <w:proofErr w:type="spellStart"/>
-            <w:r>
-              <w:rPr>
-                <w:rFonts w:ascii="Times New Roman" w:eastAsia="Times New Roman" w:hAnsi="Times New Roman" w:cs="Times New Roman"/>
-              </w:rPr>
-              <w:t>Dobai</w:t>
-            </w:r>
-            <w:proofErr w:type="spellEnd"/>
-            <w:r>
-              <w:rPr>
-                <w:rFonts w:ascii="Times New Roman" w:eastAsia="Times New Roman" w:hAnsi="Times New Roman" w:cs="Times New Roman"/>
-              </w:rPr>
-              <w:t xml:space="preserve"> Tamás, mint </w:t>
+            <w:r>
+              <w:rPr>
+                <w:rFonts w:ascii="Times New Roman" w:eastAsia="Times New Roman" w:hAnsi="Times New Roman" w:cs="Times New Roman"/>
+              </w:rPr>
+              <w:t xml:space="preserve">Dobai Tamás, mint </w:t>
             </w:r>
             <w:r>
               <w:rPr>
@@ -524,7 +509,6 @@
           <w:rFonts w:ascii="Times New Roman" w:eastAsia="Times New Roman" w:hAnsi="Times New Roman" w:cs="Times New Roman"/>
         </w:rPr>
       </w:pPr>
-      <w:proofErr w:type="gramStart"/>
       <w:r>
         <w:rPr>
           <w:rFonts w:ascii="Times New Roman" w:eastAsia="Times New Roman" w:hAnsi="Times New Roman" w:cs="Times New Roman"/>
@@ -537,34 +521,13 @@
         <w:rPr>
           <w:rFonts w:ascii="Times New Roman" w:eastAsia="Times New Roman" w:hAnsi="Times New Roman" w:cs="Times New Roman"/>
         </w:rPr>
-        <w:t xml:space="preserve">   </w:t>
-      </w:r>
-      <w:proofErr w:type="gramEnd"/>
-      <w:r>
-        <w:rPr>
-          <w:rFonts w:ascii="Times New Roman" w:eastAsia="Times New Roman" w:hAnsi="Times New Roman" w:cs="Times New Roman"/>
-        </w:rPr>
-        <w:t xml:space="preserve">  </w:t>
+        <w:t xml:space="preserve">     </w:t>
       </w:r>
       <w:r>
         <w:rPr>
           <w:rFonts w:ascii="Times New Roman" w:hAnsi="Times New Roman" w:cs="Times New Roman"/>
         </w:rPr>
-        <w:t>[[</w:t>
-      </w:r>
-      <w:proofErr w:type="spellStart"/>
-      <w:r>
-        <w:rPr>
-          <w:rFonts w:ascii="Times New Roman" w:hAnsi="Times New Roman" w:cs="Times New Roman"/>
-        </w:rPr>
-        <w:t>nev</w:t>
-      </w:r>
-      <w:proofErr w:type="spellEnd"/>
-      <w:r>
-        <w:rPr>
-          <w:rFonts w:ascii="Times New Roman" w:hAnsi="Times New Roman" w:cs="Times New Roman"/>
-        </w:rPr>
-        <w:t>]]</w:t>
+        <w:t>[[nev]]</w:t>
       </w:r>
       <w:r>
         <w:rPr>
@@ -603,21 +566,7 @@
         <w:rPr>
           <w:rFonts w:ascii="Times New Roman" w:eastAsia="Times New Roman" w:hAnsi="Times New Roman" w:cs="Times New Roman"/>
         </w:rPr>
-        <w:t>[[</w:t>
-      </w:r>
-      <w:proofErr w:type="spellStart"/>
-      <w:r>
-        <w:rPr>
-          <w:rFonts w:ascii="Times New Roman" w:eastAsia="Times New Roman" w:hAnsi="Times New Roman" w:cs="Times New Roman"/>
-        </w:rPr>
-        <w:t>cim</w:t>
-      </w:r>
-      <w:proofErr w:type="spellEnd"/>
-      <w:r>
-        <w:rPr>
-          <w:rFonts w:ascii="Times New Roman" w:eastAsia="Times New Roman" w:hAnsi="Times New Roman" w:cs="Times New Roman"/>
-        </w:rPr>
-        <w:t>]]</w:t>
+        <w:t>[[cim]]</w:t>
       </w:r>
       <w:r>
         <w:rPr>
@@ -663,21 +612,7 @@
         <w:rPr>
           <w:rFonts w:ascii="Times New Roman" w:eastAsia="Times New Roman" w:hAnsi="Times New Roman" w:cs="Times New Roman"/>
         </w:rPr>
-        <w:t>[[</w:t>
-      </w:r>
-      <w:proofErr w:type="spellStart"/>
-      <w:r>
-        <w:rPr>
-          <w:rFonts w:ascii="Times New Roman" w:eastAsia="Times New Roman" w:hAnsi="Times New Roman" w:cs="Times New Roman"/>
-        </w:rPr>
-        <w:t>szemelyi</w:t>
-      </w:r>
-      <w:proofErr w:type="spellEnd"/>
-      <w:r>
-        <w:rPr>
-          <w:rFonts w:ascii="Times New Roman" w:eastAsia="Times New Roman" w:hAnsi="Times New Roman" w:cs="Times New Roman"/>
-        </w:rPr>
-        <w:t>]]</w:t>
+        <w:t>[[szemelyi]]</w:t>
       </w:r>
     </w:p>
     <w:p>
@@ -733,21 +668,7 @@
         <w:rPr>
           <w:rFonts w:ascii="Times New Roman" w:eastAsia="Times New Roman" w:hAnsi="Times New Roman" w:cs="Times New Roman"/>
         </w:rPr>
-        <w:t>A munkák megkezdésének dátuma: (</w:t>
-      </w:r>
-      <w:proofErr w:type="spellStart"/>
-      <w:r>
-        <w:rPr>
-          <w:rFonts w:ascii="Times New Roman" w:eastAsia="Times New Roman" w:hAnsi="Times New Roman" w:cs="Times New Roman"/>
-        </w:rPr>
-        <w:t>év.hónap.nap</w:t>
-      </w:r>
-      <w:proofErr w:type="spellEnd"/>
-      <w:r>
-        <w:rPr>
-          <w:rFonts w:ascii="Times New Roman" w:eastAsia="Times New Roman" w:hAnsi="Times New Roman" w:cs="Times New Roman"/>
-        </w:rPr>
-        <w:t>. óra. perc)</w:t>
+        <w:t>A munkák megkezdésének dátuma: (év.hónap.nap. óra. perc)</w:t>
       </w:r>
     </w:p>
     <w:p>
@@ -769,8 +690,36 @@
         <w:rPr>
           <w:rFonts w:ascii="Times New Roman" w:eastAsia="Times New Roman" w:hAnsi="Times New Roman" w:cs="Times New Roman"/>
         </w:rPr>
-        <w:t>9.00</w:t>
-      </w:r>
+        <w:t xml:space="preserve"> </w:t>
+      </w:r>
+      <w:r>
+        <w:rPr>
+          <w:rFonts w:ascii="Times New Roman" w:eastAsia="Times New Roman" w:hAnsi="Times New Roman" w:cs="Times New Roman"/>
+        </w:rPr>
+        <w:t>[[</w:t>
+      </w:r>
+      <w:r>
+        <w:rPr>
+          <w:rFonts w:ascii="Times New Roman" w:eastAsia="Times New Roman" w:hAnsi="Times New Roman" w:cs="Times New Roman"/>
+        </w:rPr>
+        <w:t>ora kezdes</w:t>
+      </w:r>
+      <w:r>
+        <w:rPr>
+          <w:rFonts w:ascii="Times New Roman" w:eastAsia="Times New Roman" w:hAnsi="Times New Roman" w:cs="Times New Roman"/>
+        </w:rPr>
+        <w:t>]],</w:t>
+      </w:r>
+    </w:p>
+    <w:p>
+      <w:pPr>
+        <w:spacing w:after="0" w:line="240" w:lineRule="auto"/>
+        <w:ind w:left="-6" w:hanging="11"/>
+        <w:jc w:val="left"/>
+        <w:rPr>
+          <w:rFonts w:ascii="Times New Roman" w:eastAsia="Times New Roman" w:hAnsi="Times New Roman" w:cs="Times New Roman"/>
+        </w:rPr>
+      </w:pPr>
     </w:p>
     <w:p>
       <w:pPr>
@@ -785,35 +734,7 @@
         <w:rPr>
           <w:rFonts w:ascii="Times New Roman" w:eastAsia="Times New Roman" w:hAnsi="Times New Roman" w:cs="Times New Roman"/>
         </w:rPr>
-        <w:t xml:space="preserve">A kivitelezés befejezésének </w:t>
-      </w:r>
-      <w:proofErr w:type="gramStart"/>
-      <w:r>
-        <w:rPr>
-          <w:rFonts w:ascii="Times New Roman" w:eastAsia="Times New Roman" w:hAnsi="Times New Roman" w:cs="Times New Roman"/>
-        </w:rPr>
-        <w:t>dátuma :</w:t>
-      </w:r>
-      <w:proofErr w:type="gramEnd"/>
-      <w:r>
-        <w:rPr>
-          <w:rFonts w:ascii="Times New Roman" w:eastAsia="Times New Roman" w:hAnsi="Times New Roman" w:cs="Times New Roman"/>
-        </w:rPr>
-        <w:t xml:space="preserve"> (</w:t>
-      </w:r>
-      <w:proofErr w:type="spellStart"/>
-      <w:r>
-        <w:rPr>
-          <w:rFonts w:ascii="Times New Roman" w:eastAsia="Times New Roman" w:hAnsi="Times New Roman" w:cs="Times New Roman"/>
-        </w:rPr>
-        <w:t>év.hónap.nap</w:t>
-      </w:r>
-      <w:proofErr w:type="spellEnd"/>
-      <w:r>
-        <w:rPr>
-          <w:rFonts w:ascii="Times New Roman" w:eastAsia="Times New Roman" w:hAnsi="Times New Roman" w:cs="Times New Roman"/>
-        </w:rPr>
-        <w:t xml:space="preserve">. óra. perc) </w:t>
+        <w:t xml:space="preserve">A kivitelezés befejezésének dátuma : (év.hónap.nap. óra. perc) </w:t>
       </w:r>
     </w:p>
     <w:p>
@@ -835,7 +756,25 @@
         <w:rPr>
           <w:rFonts w:ascii="Times New Roman" w:eastAsia="Times New Roman" w:hAnsi="Times New Roman" w:cs="Times New Roman"/>
         </w:rPr>
-        <w:t>16.00</w:t>
+        <w:t xml:space="preserve"> </w:t>
+      </w:r>
+      <w:r>
+        <w:rPr>
+          <w:rFonts w:ascii="Times New Roman" w:eastAsia="Times New Roman" w:hAnsi="Times New Roman" w:cs="Times New Roman"/>
+        </w:rPr>
+        <w:t xml:space="preserve">[[ora </w:t>
+      </w:r>
+      <w:r>
+        <w:rPr>
+          <w:rFonts w:ascii="Times New Roman" w:eastAsia="Times New Roman" w:hAnsi="Times New Roman" w:cs="Times New Roman"/>
+        </w:rPr>
+        <w:t>vege</w:t>
+      </w:r>
+      <w:r>
+        <w:rPr>
+          <w:rFonts w:ascii="Times New Roman" w:eastAsia="Times New Roman" w:hAnsi="Times New Roman" w:cs="Times New Roman"/>
+        </w:rPr>
+        <w:t>]],</w:t>
       </w:r>
     </w:p>
     <w:p>
@@ -1035,21 +974,7 @@
               <w:rPr>
                 <w:rFonts w:ascii="Times New Roman" w:eastAsia="Times New Roman" w:hAnsi="Times New Roman" w:cs="Times New Roman"/>
               </w:rPr>
-              <w:t>Párafékező fólia (</w:t>
-            </w:r>
-            <w:proofErr w:type="spellStart"/>
-            <w:r>
-              <w:rPr>
-                <w:rFonts w:ascii="Times New Roman" w:eastAsia="Times New Roman" w:hAnsi="Times New Roman" w:cs="Times New Roman"/>
-              </w:rPr>
-              <w:t>Sd</w:t>
-            </w:r>
-            <w:proofErr w:type="spellEnd"/>
-            <w:r>
-              <w:rPr>
-                <w:rFonts w:ascii="Times New Roman" w:eastAsia="Times New Roman" w:hAnsi="Times New Roman" w:cs="Times New Roman"/>
-              </w:rPr>
-              <w:t xml:space="preserve"> ≥ 20 m)</w:t>
+              <w:t>Párafékező fólia (Sd ≥ 20 m)</w:t>
             </w:r>
           </w:p>
         </w:tc>
@@ -1142,21 +1067,7 @@
               <w:rPr>
                 <w:rFonts w:ascii="Times New Roman" w:eastAsia="Times New Roman" w:hAnsi="Times New Roman" w:cs="Times New Roman"/>
               </w:rPr>
-              <w:t>(2x12,</w:t>
-            </w:r>
-            <w:proofErr w:type="gramStart"/>
-            <w:r>
-              <w:rPr>
-                <w:rFonts w:ascii="Times New Roman" w:eastAsia="Times New Roman" w:hAnsi="Times New Roman" w:cs="Times New Roman"/>
-              </w:rPr>
-              <w:t>5)=</w:t>
-            </w:r>
-            <w:proofErr w:type="gramEnd"/>
-            <w:r>
-              <w:rPr>
-                <w:rFonts w:ascii="Times New Roman" w:eastAsia="Times New Roman" w:hAnsi="Times New Roman" w:cs="Times New Roman"/>
-              </w:rPr>
-              <w:t xml:space="preserve"> 25 cm vastagságban, fenti m2 mennyiségben</w:t>
+              <w:t>(2x12,5)= 25 cm vastagságban, fenti m2 mennyiségben</w:t>
             </w:r>
           </w:p>
         </w:tc>
@@ -1205,21 +1116,7 @@
               <w:rPr>
                 <w:rFonts w:ascii="Times New Roman" w:eastAsia="Times New Roman" w:hAnsi="Times New Roman" w:cs="Times New Roman"/>
               </w:rPr>
-              <w:t>Páraáteresztő por elleni védő fólia ((</w:t>
-            </w:r>
-            <w:proofErr w:type="spellStart"/>
-            <w:r>
-              <w:rPr>
-                <w:rFonts w:ascii="Times New Roman" w:eastAsia="Times New Roman" w:hAnsi="Times New Roman" w:cs="Times New Roman"/>
-              </w:rPr>
-              <w:t>Sd</w:t>
-            </w:r>
-            <w:proofErr w:type="spellEnd"/>
-            <w:r>
-              <w:rPr>
-                <w:rFonts w:ascii="Times New Roman" w:eastAsia="Times New Roman" w:hAnsi="Times New Roman" w:cs="Times New Roman"/>
-              </w:rPr>
-              <w:t xml:space="preserve"> ≥ 0,03 m)</w:t>
+              <w:t>Páraáteresztő por elleni védő fólia ((Sd ≥ 0,03 m)</w:t>
             </w:r>
           </w:p>
         </w:tc>
@@ -1597,14 +1494,8 @@
         <w:rPr>
           <w:rFonts w:ascii="Times New Roman" w:eastAsia="Times New Roman" w:hAnsi="Times New Roman" w:cs="Times New Roman"/>
         </w:rPr>
-        <w:t xml:space="preserve">Megrendelő kifejezetten felhatalmazza a Vállalkozót, hogy esetleges név-, adat-, dátum, számelírás, vagy nyilvánvaló számítási hiba tekintetében e hibákat közvetlenül a dokumentum szövegére írás útján- </w:t>
-      </w:r>
-      <w:r>
-        <w:rPr>
-          <w:rFonts w:ascii="Times New Roman" w:eastAsia="Times New Roman" w:hAnsi="Times New Roman" w:cs="Times New Roman"/>
-        </w:rPr>
         <w:lastRenderedPageBreak/>
-        <w:t xml:space="preserve">mely elírás kiterjed minden dokumentum javításra-, és bélyegzővel ellátva kijavítsa. Az ilyen kijavítás nem minősül megállapodás módosításnak. </w:t>
+        <w:t xml:space="preserve">Megrendelő kifejezetten felhatalmazza a Vállalkozót, hogy esetleges név-, adat-, dátum, számelírás, vagy nyilvánvaló számítási hiba tekintetében e hibákat közvetlenül a dokumentum szövegére írás útján- mely elírás kiterjed minden dokumentum javításra-, és bélyegzővel ellátva kijavítsa. Az ilyen kijavítás nem minősül megállapodás módosításnak. </w:t>
       </w:r>
     </w:p>
     <w:p>
@@ -1799,21 +1690,7 @@
         <w:rPr>
           <w:rFonts w:ascii="Times New Roman" w:eastAsia="Times New Roman" w:hAnsi="Times New Roman" w:cs="Times New Roman"/>
         </w:rPr>
-        <w:t xml:space="preserve">Kelt.: </w:t>
-      </w:r>
-      <w:proofErr w:type="gramStart"/>
-      <w:r>
-        <w:rPr>
-          <w:rFonts w:ascii="Times New Roman" w:eastAsia="Times New Roman" w:hAnsi="Times New Roman" w:cs="Times New Roman"/>
-        </w:rPr>
-        <w:t>Rád ,</w:t>
-      </w:r>
-      <w:proofErr w:type="gramEnd"/>
-      <w:r>
-        <w:rPr>
-          <w:rFonts w:ascii="Times New Roman" w:eastAsia="Times New Roman" w:hAnsi="Times New Roman" w:cs="Times New Roman"/>
-        </w:rPr>
-        <w:t xml:space="preserve"> [[datum]]</w:t>
+        <w:t>Kelt.: Rád , [[datum]]</w:t>
       </w:r>
     </w:p>
     <w:p>
@@ -1833,7 +1710,7 @@
           <w:szCs w:val="21"/>
         </w:rPr>
         <w:drawing>
-          <wp:anchor distT="0" distB="0" distL="114300" distR="114300" simplePos="0" relativeHeight="251657728" behindDoc="0" locked="0" layoutInCell="1" allowOverlap="1" wp14:anchorId="703A328D" wp14:editId="061C9A4F">
+          <wp:anchor distT="0" distB="0" distL="114300" distR="114300" simplePos="0" relativeHeight="251657728" behindDoc="0" locked="0" layoutInCell="1" allowOverlap="1" wp14:anchorId="703A328D" wp14:editId="7F9D3206">
             <wp:simplePos x="0" y="0"/>
             <wp:positionH relativeFrom="margin">
               <wp:posOffset>3549047</wp:posOffset>
@@ -2004,21 +1881,7 @@
               <w:rPr>
                 <w:rFonts w:ascii="Times New Roman" w:eastAsia="Times New Roman" w:hAnsi="Times New Roman" w:cs="Times New Roman"/>
               </w:rPr>
-              <w:t>………………………………</w:t>
-            </w:r>
-            <w:proofErr w:type="gramStart"/>
-            <w:r>
-              <w:rPr>
-                <w:rFonts w:ascii="Times New Roman" w:eastAsia="Times New Roman" w:hAnsi="Times New Roman" w:cs="Times New Roman"/>
-              </w:rPr>
-              <w:t>…….</w:t>
-            </w:r>
-            <w:proofErr w:type="gramEnd"/>
-            <w:r>
-              <w:rPr>
-                <w:rFonts w:ascii="Times New Roman" w:eastAsia="Times New Roman" w:hAnsi="Times New Roman" w:cs="Times New Roman"/>
-              </w:rPr>
-              <w:t>.</w:t>
+              <w:t>……………………………………..</w:t>
             </w:r>
             <w:r>
               <w:rPr>
@@ -2083,76 +1946,6 @@
             <w:r>
               <w:rPr>
                 <w:rFonts w:ascii="Times New Roman" w:eastAsia="Times New Roman" w:hAnsi="Times New Roman" w:cs="Times New Roman"/>
-                <w:noProof/>
-                <w:sz w:val="21"/>
-                <w:szCs w:val="21"/>
-              </w:rPr>
-              <w:drawing>
-                <wp:anchor distT="0" distB="0" distL="114300" distR="114300" simplePos="0" relativeHeight="251672064" behindDoc="0" locked="0" layoutInCell="1" allowOverlap="1" wp14:anchorId="10AD696C" wp14:editId="45E8CBB7">
-                  <wp:simplePos x="0" y="0"/>
-                  <wp:positionH relativeFrom="margin">
-                    <wp:posOffset>445770</wp:posOffset>
-                  </wp:positionH>
-                  <wp:positionV relativeFrom="paragraph">
-                    <wp:posOffset>-1538605</wp:posOffset>
-                  </wp:positionV>
-                  <wp:extent cx="2311356" cy="3090902"/>
-                  <wp:effectExtent l="0" t="0" r="0" b="0"/>
-                  <wp:wrapNone/>
-                  <wp:docPr id="1178979612" name="Kép 2"/>
-                  <wp:cNvGraphicFramePr>
-                    <a:graphicFrameLocks xmlns:a="http://schemas.openxmlformats.org/drawingml/2006/main" noChangeAspect="1"/>
-                  </wp:cNvGraphicFramePr>
-                  <a:graphic xmlns:a="http://schemas.openxmlformats.org/drawingml/2006/main">
-                    <a:graphicData uri="http://schemas.openxmlformats.org/drawingml/2006/picture">
-                      <pic:pic xmlns:pic="http://schemas.openxmlformats.org/drawingml/2006/picture">
-                        <pic:nvPicPr>
-                          <pic:cNvPr id="0" name="Picture 2"/>
-                          <pic:cNvPicPr>
-                            <a:picLocks noChangeAspect="1" noChangeArrowheads="1"/>
-                          </pic:cNvPicPr>
-                        </pic:nvPicPr>
-                        <pic:blipFill>
-                          <a:blip r:embed="rId9" cstate="print">
-                            <a:extLst>
-                              <a:ext uri="{28A0092B-C50C-407E-A947-70E740481C1C}">
-                                <a14:useLocalDpi xmlns:a14="http://schemas.microsoft.com/office/drawing/2010/main" val="0"/>
-                              </a:ext>
-                            </a:extLst>
-                          </a:blip>
-                          <a:srcRect/>
-                          <a:stretch>
-                            <a:fillRect/>
-                          </a:stretch>
-                        </pic:blipFill>
-                        <pic:spPr bwMode="auto">
-                          <a:xfrm>
-                            <a:off x="0" y="0"/>
-                            <a:ext cx="2311356" cy="3090902"/>
-                          </a:xfrm>
-                          <a:prstGeom prst="rect">
-                            <a:avLst/>
-                          </a:prstGeom>
-                          <a:noFill/>
-                          <a:ln>
-                            <a:noFill/>
-                          </a:ln>
-                        </pic:spPr>
-                      </pic:pic>
-                    </a:graphicData>
-                  </a:graphic>
-                  <wp14:sizeRelH relativeFrom="margin">
-                    <wp14:pctWidth>0</wp14:pctWidth>
-                  </wp14:sizeRelH>
-                  <wp14:sizeRelV relativeFrom="margin">
-                    <wp14:pctHeight>0</wp14:pctHeight>
-                  </wp14:sizeRelV>
-                </wp:anchor>
-              </w:drawing>
-            </w:r>
-            <w:r>
-              <w:rPr>
-                <w:rFonts w:ascii="Times New Roman" w:eastAsia="Times New Roman" w:hAnsi="Times New Roman" w:cs="Times New Roman"/>
               </w:rPr>
               <w:t xml:space="preserve">BO-ZSO Hungary Kft </w:t>
             </w:r>
@@ -2190,6 +1983,76 @@
           <w:rFonts w:ascii="Times New Roman" w:eastAsia="Times New Roman" w:hAnsi="Times New Roman" w:cs="Times New Roman"/>
         </w:rPr>
       </w:pPr>
+      <w:r>
+        <w:rPr>
+          <w:rFonts w:ascii="Times New Roman" w:eastAsia="Times New Roman" w:hAnsi="Times New Roman" w:cs="Times New Roman"/>
+          <w:noProof/>
+          <w:sz w:val="21"/>
+          <w:szCs w:val="21"/>
+        </w:rPr>
+        <w:drawing>
+          <wp:anchor distT="0" distB="0" distL="114300" distR="114300" simplePos="0" relativeHeight="251672064" behindDoc="0" locked="0" layoutInCell="1" allowOverlap="1" wp14:anchorId="10AD696C" wp14:editId="51A10195">
+            <wp:simplePos x="0" y="0"/>
+            <wp:positionH relativeFrom="margin">
+              <wp:posOffset>3210560</wp:posOffset>
+            </wp:positionH>
+            <wp:positionV relativeFrom="paragraph">
+              <wp:posOffset>28575</wp:posOffset>
+            </wp:positionV>
+            <wp:extent cx="2310765" cy="3090545"/>
+            <wp:effectExtent l="0" t="0" r="0" b="0"/>
+            <wp:wrapNone/>
+            <wp:docPr id="1178979612" name="Kép 2"/>
+            <wp:cNvGraphicFramePr>
+              <a:graphicFrameLocks xmlns:a="http://schemas.openxmlformats.org/drawingml/2006/main" noChangeAspect="1"/>
+            </wp:cNvGraphicFramePr>
+            <a:graphic xmlns:a="http://schemas.openxmlformats.org/drawingml/2006/main">
+              <a:graphicData uri="http://schemas.openxmlformats.org/drawingml/2006/picture">
+                <pic:pic xmlns:pic="http://schemas.openxmlformats.org/drawingml/2006/picture">
+                  <pic:nvPicPr>
+                    <pic:cNvPr id="0" name="Picture 2"/>
+                    <pic:cNvPicPr>
+                      <a:picLocks noChangeAspect="1" noChangeArrowheads="1"/>
+                    </pic:cNvPicPr>
+                  </pic:nvPicPr>
+                  <pic:blipFill>
+                    <a:blip r:embed="rId9" cstate="print">
+                      <a:extLst>
+                        <a:ext uri="{28A0092B-C50C-407E-A947-70E740481C1C}">
+                          <a14:useLocalDpi xmlns:a14="http://schemas.microsoft.com/office/drawing/2010/main" val="0"/>
+                        </a:ext>
+                      </a:extLst>
+                    </a:blip>
+                    <a:srcRect/>
+                    <a:stretch>
+                      <a:fillRect/>
+                    </a:stretch>
+                  </pic:blipFill>
+                  <pic:spPr bwMode="auto">
+                    <a:xfrm>
+                      <a:off x="0" y="0"/>
+                      <a:ext cx="2310765" cy="3090545"/>
+                    </a:xfrm>
+                    <a:prstGeom prst="rect">
+                      <a:avLst/>
+                    </a:prstGeom>
+                    <a:noFill/>
+                    <a:ln>
+                      <a:noFill/>
+                    </a:ln>
+                  </pic:spPr>
+                </pic:pic>
+              </a:graphicData>
+            </a:graphic>
+            <wp14:sizeRelH relativeFrom="margin">
+              <wp14:pctWidth>0</wp14:pctWidth>
+            </wp14:sizeRelH>
+            <wp14:sizeRelV relativeFrom="margin">
+              <wp14:pctHeight>0</wp14:pctHeight>
+            </wp14:sizeRelV>
+          </wp:anchor>
+        </w:drawing>
+      </w:r>
     </w:p>
     <w:p/>
     <w:sectPr>

</xml_diff>